<commit_message>
updated all html files, and the css file, and the privacy policy document. I have made changes to the content and design of the website to improve user experience and provide more information about our products and services. The changes include updating the layout, adding new sections, and enhancing the overall look and feel of the website. I have also made sure to maintain consistency across all pages and ensure that the website is responsive and accessible on different devices.
</commit_message>
<xml_diff>
--- a/privacy-policy.docx
+++ b/privacy-policy.docx
@@ -2,19 +2,12 @@
 <file path=word/document.xml><?xml version="1.0" encoding="utf-8"?>
 <w:document xmlns:wpc="http://schemas.microsoft.com/office/word/2010/wordprocessingCanvas" xmlns:cx="http://schemas.microsoft.com/office/drawing/2014/chartex" xmlns:cx1="http://schemas.microsoft.com/office/drawing/2015/9/8/chartex" xmlns:cx2="http://schemas.microsoft.com/office/drawing/2015/10/21/chartex" xmlns:cx3="http://schemas.microsoft.com/office/drawing/2016/5/9/chartex" xmlns:cx4="http://schemas.microsoft.com/office/drawing/2016/5/10/chartex" xmlns:cx5="http://schemas.microsoft.com/office/drawing/2016/5/11/chartex" xmlns:cx6="http://schemas.microsoft.com/office/drawing/2016/5/12/chartex" xmlns:cx7="http://schemas.microsoft.com/office/drawing/2016/5/13/chartex" xmlns:cx8="http://schemas.microsoft.com/office/drawing/2016/5/14/chartex" xmlns:mc="http://schemas.openxmlformats.org/markup-compatibility/2006" xmlns:aink="http://schemas.microsoft.com/office/drawing/2016/ink" xmlns:am3d="http://schemas.microsoft.com/office/drawing/2017/model3d" xmlns:o="urn:schemas-microsoft-com:office:office" xmlns:oel="http://schemas.microsoft.com/office/2019/extlst" xmlns:r="http://schemas.openxmlformats.org/officeDocument/2006/relationships" xmlns:m="http://schemas.openxmlformats.org/officeDocument/2006/math" xmlns:v="urn:schemas-microsoft-com:vml" xmlns:wp14="http://schemas.microsoft.com/office/word/2010/wordprocessingDrawing" xmlns:wp="http://schemas.openxmlformats.org/drawingml/2006/wordprocessingDrawing" xmlns:w10="urn:schemas-microsoft-com:office:word" xmlns:w="http://schemas.openxmlformats.org/wordprocessingml/2006/main" xmlns:w14="http://schemas.microsoft.com/office/word/2010/wordml" xmlns:w15="http://schemas.microsoft.com/office/word/2012/wordml" xmlns:w16cex="http://schemas.microsoft.com/office/word/2018/wordml/cex" xmlns:w16cid="http://schemas.microsoft.com/office/word/2016/wordml/cid" xmlns:w16="http://schemas.microsoft.com/office/word/2018/wordml" xmlns:w16du="http://schemas.microsoft.com/office/word/2023/wordml/word16du" xmlns:w16sdtdh="http://schemas.microsoft.com/office/word/2020/wordml/sdtdatahash" xmlns:w16sdtfl="http://schemas.microsoft.com/office/word/2024/wordml/sdtformatlock" xmlns:w16se="http://schemas.microsoft.com/office/word/2015/wordml/symex" xmlns:wpg="http://schemas.microsoft.com/office/word/2010/wordprocessingGroup" xmlns:wpi="http://schemas.microsoft.com/office/word/2010/wordprocessingInk" xmlns:wne="http://schemas.microsoft.com/office/word/2006/wordml" xmlns:wps="http://schemas.microsoft.com/office/word/2010/wordprocessingShape" mc:Ignorable="w14 w15 w16se w16cid w16 w16cex w16sdtdh w16sdtfl w16du wp14">
   <w:body>
-    <w:p>
-      <w:pPr>
-        <w:rPr>
-          <w:lang w:val="en-BW"/>
-        </w:rPr>
-      </w:pPr>
-    </w:p>
-    <w:p>
-      <w:pPr>
-        <w:rPr>
-          <w:b/>
-          <w:bCs/>
-          <w:lang w:val="en-BW"/>
+    <w:p/>
+    <w:p>
+      <w:pPr>
+        <w:rPr>
+          <w:b/>
+          <w:bCs/>
         </w:rPr>
       </w:pPr>
       <w:r>
@@ -22,7 +15,6 @@
           <w:rFonts w:ascii="Segoe UI Emoji" w:hAnsi="Segoe UI Emoji" w:cs="Segoe UI Emoji"/>
           <w:b/>
           <w:bCs/>
-          <w:lang w:val="en-BW"/>
         </w:rPr>
         <w:t>📜</w:t>
       </w:r>
@@ -30,7 +22,6 @@
         <w:rPr>
           <w:b/>
           <w:bCs/>
-          <w:lang w:val="en-BW"/>
         </w:rPr>
         <w:t xml:space="preserve"> Privacy Policy – </w:t>
       </w:r>
@@ -38,69 +29,38 @@
         <w:rPr>
           <w:b/>
           <w:bCs/>
-          <w:lang w:val="en-BW"/>
-        </w:rPr>
-        <w:t>T_K</w:t>
-      </w:r>
-      <w:r>
-        <w:rPr>
-          <w:b/>
-          <w:bCs/>
-          <w:lang w:val="en-BW"/>
-        </w:rPr>
-        <w:t xml:space="preserve"> Dealership</w:t>
-      </w:r>
-    </w:p>
-    <w:p>
-      <w:pPr>
-        <w:rPr>
-          <w:lang w:val="en-BW"/>
-        </w:rPr>
-      </w:pPr>
-      <w:r>
-        <w:rPr>
-          <w:b/>
-          <w:bCs/>
-          <w:lang w:val="en-BW"/>
+        </w:rPr>
+        <w:t>FASHIONHUB</w:t>
+      </w:r>
+    </w:p>
+    <w:p>
+      <w:r>
+        <w:rPr>
+          <w:b/>
+          <w:bCs/>
         </w:rPr>
         <w:t>Effective Date:</w:t>
       </w:r>
       <w:r>
-        <w:rPr>
-          <w:lang w:val="en-BW"/>
-        </w:rPr>
         <w:t xml:space="preserve"> </w:t>
       </w:r>
       <w:r>
-        <w:rPr>
-          <w:lang w:val="en-BW"/>
-        </w:rPr>
         <w:t>01/01/2026</w:t>
       </w:r>
       <w:r>
-        <w:rPr>
-          <w:lang w:val="en-BW"/>
-        </w:rPr>
         <w:br/>
       </w:r>
       <w:r>
         <w:rPr>
           <w:b/>
           <w:bCs/>
-          <w:lang w:val="en-BW"/>
         </w:rPr>
         <w:t>Last Updated:</w:t>
       </w:r>
       <w:r>
-        <w:rPr>
-          <w:lang w:val="en-BW"/>
-        </w:rPr>
         <w:t xml:space="preserve"> </w:t>
       </w:r>
       <w:r>
-        <w:rPr>
-          <w:lang w:val="en-BW"/>
-        </w:rPr>
         <w:t>24/02/2026</w:t>
       </w:r>
     </w:p>
@@ -109,55 +69,31 @@
         <w:rPr>
           <w:b/>
           <w:bCs/>
-          <w:lang w:val="en-BW"/>
-        </w:rPr>
-      </w:pPr>
-      <w:r>
-        <w:rPr>
-          <w:b/>
-          <w:bCs/>
-          <w:lang w:val="en-BW"/>
+        </w:rPr>
+      </w:pPr>
+      <w:r>
+        <w:rPr>
+          <w:b/>
+          <w:bCs/>
         </w:rPr>
         <w:t>1. Introduction</w:t>
       </w:r>
     </w:p>
     <w:p>
-      <w:pPr>
-        <w:rPr>
-          <w:lang w:val="en-BW"/>
-        </w:rPr>
-      </w:pPr>
-      <w:r>
-        <w:rPr>
-          <w:lang w:val="en-BW"/>
-        </w:rPr>
+      <w:r>
         <w:t xml:space="preserve">At </w:t>
       </w:r>
       <w:r>
-        <w:rPr>
-          <w:lang w:val="en-BW"/>
-        </w:rPr>
-        <w:t>T_K Dealership</w:t>
-      </w:r>
-      <w:r>
-        <w:rPr>
-          <w:lang w:val="en-BW"/>
-        </w:rPr>
+        <w:t>FashionHub</w:t>
+      </w:r>
+      <w:r>
         <w:t>, we value your trust. This Privacy Policy explains how we collect, use, and protect your personal information when you interact with our dealership, whether in person, online, or through our customer service representatives (CSRs).</w:t>
       </w:r>
     </w:p>
     <w:p>
-      <w:pPr>
-        <w:rPr>
-          <w:lang w:val="en-BW"/>
-        </w:rPr>
-      </w:pPr>
-      <w:r>
-        <w:rPr>
-          <w:lang w:val="en-BW"/>
-        </w:rPr>
+      <w:r>
         <w:pict w14:anchorId="271A3979">
-          <v:rect id="_x0000_i1026" style="width:0;height:1.5pt" o:hralign="center" o:hrstd="t" o:hr="t" fillcolor="#a0a0a0" stroked="f"/>
+          <v:rect id="_x0000_i1025" style="width:0;height:1.5pt" o:hralign="center" o:hrstd="t" o:hr="t" fillcolor="#a0a0a0" stroked="f"/>
         </w:pict>
       </w:r>
     </w:p>
@@ -166,28 +102,18 @@
         <w:rPr>
           <w:b/>
           <w:bCs/>
-          <w:lang w:val="en-BW"/>
-        </w:rPr>
-      </w:pPr>
-      <w:r>
-        <w:rPr>
-          <w:b/>
-          <w:bCs/>
-          <w:lang w:val="en-BW"/>
+        </w:rPr>
+      </w:pPr>
+      <w:r>
+        <w:rPr>
+          <w:b/>
+          <w:bCs/>
         </w:rPr>
         <w:t>2. Information We Collect</w:t>
       </w:r>
     </w:p>
     <w:p>
-      <w:pPr>
-        <w:rPr>
-          <w:lang w:val="en-BW"/>
-        </w:rPr>
-      </w:pPr>
-      <w:r>
-        <w:rPr>
-          <w:lang w:val="en-BW"/>
-        </w:rPr>
+      <w:r>
         <w:t>We may collect the following types of information:</w:t>
       </w:r>
     </w:p>
@@ -197,22 +123,15 @@
           <w:ilvl w:val="0"/>
           <w:numId w:val="1"/>
         </w:numPr>
-        <w:rPr>
-          <w:lang w:val="en-BW"/>
-        </w:rPr>
-      </w:pPr>
-      <w:r>
-        <w:rPr>
-          <w:b/>
-          <w:bCs/>
-          <w:lang w:val="en-BW"/>
+      </w:pPr>
+      <w:r>
+        <w:rPr>
+          <w:b/>
+          <w:bCs/>
         </w:rPr>
         <w:t>Personal details</w:t>
       </w:r>
       <w:r>
-        <w:rPr>
-          <w:lang w:val="en-BW"/>
-        </w:rPr>
         <w:t>: Name, phone number, email address, physical address.</w:t>
       </w:r>
     </w:p>
@@ -222,22 +141,15 @@
           <w:ilvl w:val="0"/>
           <w:numId w:val="1"/>
         </w:numPr>
-        <w:rPr>
-          <w:lang w:val="en-BW"/>
-        </w:rPr>
-      </w:pPr>
-      <w:r>
-        <w:rPr>
-          <w:b/>
-          <w:bCs/>
-          <w:lang w:val="en-BW"/>
+      </w:pPr>
+      <w:r>
+        <w:rPr>
+          <w:b/>
+          <w:bCs/>
         </w:rPr>
         <w:t>Financial information</w:t>
       </w:r>
       <w:r>
-        <w:rPr>
-          <w:lang w:val="en-BW"/>
-        </w:rPr>
         <w:t>: Payment details, financing applications (processed securely).</w:t>
       </w:r>
     </w:p>
@@ -247,37 +159,22 @@
           <w:ilvl w:val="0"/>
           <w:numId w:val="1"/>
         </w:numPr>
-        <w:rPr>
-          <w:lang w:val="en-BW"/>
-        </w:rPr>
-      </w:pPr>
-      <w:r>
-        <w:rPr>
-          <w:b/>
-          <w:bCs/>
-          <w:lang w:val="en-BW"/>
+      </w:pPr>
+      <w:r>
+        <w:rPr>
+          <w:b/>
+          <w:bCs/>
         </w:rPr>
         <w:t>Digital interactions</w:t>
       </w:r>
       <w:r>
-        <w:rPr>
-          <w:lang w:val="en-BW"/>
-        </w:rPr>
         <w:t>: Website usage, inquiries submitted online, social media engagement.</w:t>
       </w:r>
     </w:p>
     <w:p>
-      <w:pPr>
-        <w:rPr>
-          <w:lang w:val="en-BW"/>
-        </w:rPr>
-      </w:pPr>
-      <w:r>
-        <w:rPr>
-          <w:lang w:val="en-BW"/>
-        </w:rPr>
+      <w:r>
         <w:pict w14:anchorId="341B8E08">
-          <v:rect id="_x0000_i1027" style="width:0;height:1.5pt" o:hralign="center" o:hrstd="t" o:hr="t" fillcolor="#a0a0a0" stroked="f"/>
+          <v:rect id="_x0000_i1026" style="width:0;height:1.5pt" o:hralign="center" o:hrstd="t" o:hr="t" fillcolor="#a0a0a0" stroked="f"/>
         </w:pict>
       </w:r>
     </w:p>
@@ -286,28 +183,18 @@
         <w:rPr>
           <w:b/>
           <w:bCs/>
-          <w:lang w:val="en-BW"/>
-        </w:rPr>
-      </w:pPr>
-      <w:r>
-        <w:rPr>
-          <w:b/>
-          <w:bCs/>
-          <w:lang w:val="en-BW"/>
+        </w:rPr>
+      </w:pPr>
+      <w:r>
+        <w:rPr>
+          <w:b/>
+          <w:bCs/>
         </w:rPr>
         <w:t>3. How We Use Your Information</w:t>
       </w:r>
     </w:p>
     <w:p>
-      <w:pPr>
-        <w:rPr>
-          <w:lang w:val="en-BW"/>
-        </w:rPr>
-      </w:pPr>
-      <w:r>
-        <w:rPr>
-          <w:lang w:val="en-BW"/>
-        </w:rPr>
+      <w:r>
         <w:t>Your information is used to:</w:t>
       </w:r>
     </w:p>
@@ -317,14 +204,8 @@
           <w:ilvl w:val="0"/>
           <w:numId w:val="2"/>
         </w:numPr>
-        <w:rPr>
-          <w:lang w:val="en-BW"/>
-        </w:rPr>
-      </w:pPr>
-      <w:r>
-        <w:rPr>
-          <w:lang w:val="en-BW"/>
-        </w:rPr>
+      </w:pPr>
+      <w:r>
         <w:t>Provide customer service and respond to inquiries.</w:t>
       </w:r>
     </w:p>
@@ -334,15 +215,15 @@
           <w:ilvl w:val="0"/>
           <w:numId w:val="2"/>
         </w:numPr>
-        <w:rPr>
-          <w:lang w:val="en-BW"/>
-        </w:rPr>
-      </w:pPr>
-      <w:r>
-        <w:rPr>
-          <w:lang w:val="en-BW"/>
-        </w:rPr>
-        <w:t>Process vehicle purchases, financing, and service requests.</w:t>
+      </w:pPr>
+      <w:r>
+        <w:t xml:space="preserve">Process </w:t>
+      </w:r>
+      <w:r>
+        <w:t>product</w:t>
+      </w:r>
+      <w:r>
+        <w:t xml:space="preserve"> purchases, financing, and service requests.</w:t>
       </w:r>
     </w:p>
     <w:p>
@@ -351,15 +232,9 @@
           <w:ilvl w:val="0"/>
           <w:numId w:val="2"/>
         </w:numPr>
-        <w:rPr>
-          <w:lang w:val="en-BW"/>
-        </w:rPr>
-      </w:pPr>
-      <w:r>
-        <w:rPr>
-          <w:lang w:val="en-BW"/>
-        </w:rPr>
-        <w:t>Send updates about promotions, recalls, or dealership events.</w:t>
+      </w:pPr>
+      <w:r>
+        <w:t>Send updates about promotions, recalls, or events.</w:t>
       </w:r>
     </w:p>
     <w:p>
@@ -368,29 +243,15 @@
           <w:ilvl w:val="0"/>
           <w:numId w:val="2"/>
         </w:numPr>
-        <w:rPr>
-          <w:lang w:val="en-BW"/>
-        </w:rPr>
-      </w:pPr>
-      <w:r>
-        <w:rPr>
-          <w:lang w:val="en-BW"/>
-        </w:rPr>
+      </w:pPr>
+      <w:r>
         <w:t>Improve our services and customer experience.</w:t>
       </w:r>
     </w:p>
     <w:p>
-      <w:pPr>
-        <w:rPr>
-          <w:lang w:val="en-BW"/>
-        </w:rPr>
-      </w:pPr>
-      <w:r>
-        <w:rPr>
-          <w:lang w:val="en-BW"/>
-        </w:rPr>
+      <w:r>
         <w:pict w14:anchorId="20248FCA">
-          <v:rect id="_x0000_i1028" style="width:0;height:1.5pt" o:hralign="center" o:hrstd="t" o:hr="t" fillcolor="#a0a0a0" stroked="f"/>
+          <v:rect id="_x0000_i1027" style="width:0;height:1.5pt" o:hralign="center" o:hrstd="t" o:hr="t" fillcolor="#a0a0a0" stroked="f"/>
         </w:pict>
       </w:r>
     </w:p>
@@ -399,28 +260,18 @@
         <w:rPr>
           <w:b/>
           <w:bCs/>
-          <w:lang w:val="en-BW"/>
-        </w:rPr>
-      </w:pPr>
-      <w:r>
-        <w:rPr>
-          <w:b/>
-          <w:bCs/>
-          <w:lang w:val="en-BW"/>
+        </w:rPr>
+      </w:pPr>
+      <w:r>
+        <w:rPr>
+          <w:b/>
+          <w:bCs/>
         </w:rPr>
         <w:t>4. Sharing of Information</w:t>
       </w:r>
     </w:p>
     <w:p>
-      <w:pPr>
-        <w:rPr>
-          <w:lang w:val="en-BW"/>
-        </w:rPr>
-      </w:pPr>
-      <w:r>
-        <w:rPr>
-          <w:lang w:val="en-BW"/>
-        </w:rPr>
+      <w:r>
         <w:t>We do not sell your personal information. We may share data only with:</w:t>
       </w:r>
     </w:p>
@@ -430,22 +281,15 @@
           <w:ilvl w:val="0"/>
           <w:numId w:val="3"/>
         </w:numPr>
-        <w:rPr>
-          <w:lang w:val="en-BW"/>
-        </w:rPr>
-      </w:pPr>
-      <w:r>
-        <w:rPr>
-          <w:b/>
-          <w:bCs/>
-          <w:lang w:val="en-BW"/>
+      </w:pPr>
+      <w:r>
+        <w:rPr>
+          <w:b/>
+          <w:bCs/>
         </w:rPr>
         <w:t>Service providers</w:t>
       </w:r>
       <w:r>
-        <w:rPr>
-          <w:lang w:val="en-BW"/>
-        </w:rPr>
         <w:t xml:space="preserve"> (e.g., financing institutions, insurance partners).</w:t>
       </w:r>
     </w:p>
@@ -455,22 +299,15 @@
           <w:ilvl w:val="0"/>
           <w:numId w:val="3"/>
         </w:numPr>
-        <w:rPr>
-          <w:lang w:val="en-BW"/>
-        </w:rPr>
-      </w:pPr>
-      <w:r>
-        <w:rPr>
-          <w:b/>
-          <w:bCs/>
-          <w:lang w:val="en-BW"/>
+      </w:pPr>
+      <w:r>
+        <w:rPr>
+          <w:b/>
+          <w:bCs/>
         </w:rPr>
         <w:t>Manufacturers</w:t>
       </w:r>
       <w:r>
-        <w:rPr>
-          <w:lang w:val="en-BW"/>
-        </w:rPr>
         <w:t xml:space="preserve"> (for warranty, recalls, and compliance).</w:t>
       </w:r>
     </w:p>
@@ -480,37 +317,22 @@
           <w:ilvl w:val="0"/>
           <w:numId w:val="3"/>
         </w:numPr>
-        <w:rPr>
-          <w:lang w:val="en-BW"/>
-        </w:rPr>
-      </w:pPr>
-      <w:r>
-        <w:rPr>
-          <w:b/>
-          <w:bCs/>
-          <w:lang w:val="en-BW"/>
+      </w:pPr>
+      <w:r>
+        <w:rPr>
+          <w:b/>
+          <w:bCs/>
         </w:rPr>
         <w:t>Legal authorities</w:t>
       </w:r>
       <w:r>
-        <w:rPr>
-          <w:lang w:val="en-BW"/>
-        </w:rPr>
         <w:t xml:space="preserve"> when required by law.</w:t>
       </w:r>
     </w:p>
     <w:p>
-      <w:pPr>
-        <w:rPr>
-          <w:lang w:val="en-BW"/>
-        </w:rPr>
-      </w:pPr>
-      <w:r>
-        <w:rPr>
-          <w:lang w:val="en-BW"/>
-        </w:rPr>
+      <w:r>
         <w:pict w14:anchorId="35AD0BC7">
-          <v:rect id="_x0000_i1029" style="width:0;height:1.5pt" o:hralign="center" o:hrstd="t" o:hr="t" fillcolor="#a0a0a0" stroked="f"/>
+          <v:rect id="_x0000_i1028" style="width:0;height:1.5pt" o:hralign="center" o:hrstd="t" o:hr="t" fillcolor="#a0a0a0" stroked="f"/>
         </w:pict>
       </w:r>
     </w:p>
@@ -519,28 +341,18 @@
         <w:rPr>
           <w:b/>
           <w:bCs/>
-          <w:lang w:val="en-BW"/>
-        </w:rPr>
-      </w:pPr>
-      <w:r>
-        <w:rPr>
-          <w:b/>
-          <w:bCs/>
-          <w:lang w:val="en-BW"/>
+        </w:rPr>
+      </w:pPr>
+      <w:r>
+        <w:rPr>
+          <w:b/>
+          <w:bCs/>
         </w:rPr>
         <w:t>5. Data Protection</w:t>
       </w:r>
     </w:p>
     <w:p>
-      <w:pPr>
-        <w:rPr>
-          <w:lang w:val="en-BW"/>
-        </w:rPr>
-      </w:pPr>
-      <w:r>
-        <w:rPr>
-          <w:lang w:val="en-BW"/>
-        </w:rPr>
+      <w:r>
         <w:t>We implement safeguards to protect your information:</w:t>
       </w:r>
     </w:p>
@@ -550,14 +362,8 @@
           <w:ilvl w:val="0"/>
           <w:numId w:val="4"/>
         </w:numPr>
-        <w:rPr>
-          <w:lang w:val="en-BW"/>
-        </w:rPr>
-      </w:pPr>
-      <w:r>
-        <w:rPr>
-          <w:lang w:val="en-BW"/>
-        </w:rPr>
+      </w:pPr>
+      <w:r>
         <w:t>Secure storage systems.</w:t>
       </w:r>
     </w:p>
@@ -567,14 +373,8 @@
           <w:ilvl w:val="0"/>
           <w:numId w:val="4"/>
         </w:numPr>
-        <w:rPr>
-          <w:lang w:val="en-BW"/>
-        </w:rPr>
-      </w:pPr>
-      <w:r>
-        <w:rPr>
-          <w:lang w:val="en-BW"/>
-        </w:rPr>
+      </w:pPr>
+      <w:r>
         <w:lastRenderedPageBreak/>
         <w:t>Restricted employee access.</w:t>
       </w:r>
@@ -585,29 +385,15 @@
           <w:ilvl w:val="0"/>
           <w:numId w:val="4"/>
         </w:numPr>
-        <w:rPr>
-          <w:lang w:val="en-BW"/>
-        </w:rPr>
-      </w:pPr>
-      <w:r>
-        <w:rPr>
-          <w:lang w:val="en-BW"/>
-        </w:rPr>
+      </w:pPr>
+      <w:r>
         <w:t>Encryption for sensitive financial data.</w:t>
       </w:r>
     </w:p>
     <w:p>
-      <w:pPr>
-        <w:rPr>
-          <w:lang w:val="en-BW"/>
-        </w:rPr>
-      </w:pPr>
-      <w:r>
-        <w:rPr>
-          <w:lang w:val="en-BW"/>
-        </w:rPr>
+      <w:r>
         <w:pict w14:anchorId="4AA9B180">
-          <v:rect id="_x0000_i1030" style="width:0;height:1.5pt" o:hralign="center" o:hrstd="t" o:hr="t" fillcolor="#a0a0a0" stroked="f"/>
+          <v:rect id="_x0000_i1029" style="width:0;height:1.5pt" o:hralign="center" o:hrstd="t" o:hr="t" fillcolor="#a0a0a0" stroked="f"/>
         </w:pict>
       </w:r>
     </w:p>
@@ -616,28 +402,18 @@
         <w:rPr>
           <w:b/>
           <w:bCs/>
-          <w:lang w:val="en-BW"/>
-        </w:rPr>
-      </w:pPr>
-      <w:r>
-        <w:rPr>
-          <w:b/>
-          <w:bCs/>
-          <w:lang w:val="en-BW"/>
+        </w:rPr>
+      </w:pPr>
+      <w:r>
+        <w:rPr>
+          <w:b/>
+          <w:bCs/>
         </w:rPr>
         <w:t>6. Your Rights</w:t>
       </w:r>
     </w:p>
     <w:p>
-      <w:pPr>
-        <w:rPr>
-          <w:lang w:val="en-BW"/>
-        </w:rPr>
-      </w:pPr>
-      <w:r>
-        <w:rPr>
-          <w:lang w:val="en-BW"/>
-        </w:rPr>
+      <w:r>
         <w:t>You have the right to:</w:t>
       </w:r>
     </w:p>
@@ -647,14 +423,8 @@
           <w:ilvl w:val="0"/>
           <w:numId w:val="5"/>
         </w:numPr>
-        <w:rPr>
-          <w:lang w:val="en-BW"/>
-        </w:rPr>
-      </w:pPr>
-      <w:r>
-        <w:rPr>
-          <w:lang w:val="en-BW"/>
-        </w:rPr>
+      </w:pPr>
+      <w:r>
         <w:t>Access the personal information we hold about you.</w:t>
       </w:r>
     </w:p>
@@ -664,14 +434,8 @@
           <w:ilvl w:val="0"/>
           <w:numId w:val="5"/>
         </w:numPr>
-        <w:rPr>
-          <w:lang w:val="en-BW"/>
-        </w:rPr>
-      </w:pPr>
-      <w:r>
-        <w:rPr>
-          <w:lang w:val="en-BW"/>
-        </w:rPr>
+      </w:pPr>
+      <w:r>
         <w:t>Request corrections or updates.</w:t>
       </w:r>
     </w:p>
@@ -681,23 +445,9 @@
           <w:ilvl w:val="0"/>
           <w:numId w:val="5"/>
         </w:numPr>
-        <w:rPr>
-          <w:lang w:val="en-BW"/>
-        </w:rPr>
-      </w:pPr>
-      <w:proofErr w:type="spellStart"/>
-      <w:r>
-        <w:rPr>
-          <w:lang w:val="en-BW"/>
-        </w:rPr>
-        <w:t>Opt</w:t>
-      </w:r>
-      <w:proofErr w:type="spellEnd"/>
-      <w:r>
-        <w:rPr>
-          <w:lang w:val="en-BW"/>
-        </w:rPr>
-        <w:t xml:space="preserve"> out of marketing communications.</w:t>
+      </w:pPr>
+      <w:r>
+        <w:t>Opt out of marketing communications.</w:t>
       </w:r>
     </w:p>
     <w:p>
@@ -706,29 +456,15 @@
           <w:ilvl w:val="0"/>
           <w:numId w:val="5"/>
         </w:numPr>
-        <w:rPr>
-          <w:lang w:val="en-BW"/>
-        </w:rPr>
-      </w:pPr>
-      <w:r>
-        <w:rPr>
-          <w:lang w:val="en-BW"/>
-        </w:rPr>
+      </w:pPr>
+      <w:r>
         <w:t>Request deletion of your data, subject to legal obligations.</w:t>
       </w:r>
     </w:p>
     <w:p>
-      <w:pPr>
-        <w:rPr>
-          <w:lang w:val="en-BW"/>
-        </w:rPr>
-      </w:pPr>
-      <w:r>
-        <w:rPr>
-          <w:lang w:val="en-BW"/>
-        </w:rPr>
+      <w:r>
         <w:pict w14:anchorId="6B0B5E07">
-          <v:rect id="_x0000_i1031" style="width:0;height:1.5pt" o:hralign="center" o:hrstd="t" o:hr="t" fillcolor="#a0a0a0" stroked="f"/>
+          <v:rect id="_x0000_i1030" style="width:0;height:1.5pt" o:hralign="center" o:hrstd="t" o:hr="t" fillcolor="#a0a0a0" stroked="f"/>
         </w:pict>
       </w:r>
     </w:p>
@@ -737,95 +473,80 @@
         <w:rPr>
           <w:b/>
           <w:bCs/>
-          <w:lang w:val="en-BW"/>
-        </w:rPr>
-      </w:pPr>
-      <w:r>
-        <w:rPr>
-          <w:b/>
-          <w:bCs/>
-          <w:lang w:val="en-BW"/>
+        </w:rPr>
+      </w:pPr>
+      <w:r>
+        <w:rPr>
+          <w:b/>
+          <w:bCs/>
         </w:rPr>
         <w:t>7. Contact Us</w:t>
       </w:r>
     </w:p>
     <w:p>
-      <w:pPr>
-        <w:rPr>
-          <w:lang w:val="en-BW"/>
-        </w:rPr>
-      </w:pPr>
-      <w:r>
-        <w:rPr>
-          <w:lang w:val="en-BW"/>
-        </w:rPr>
+      <w:r>
         <w:t>If you have questions about this Privacy Policy or how your information is handled, please contact:</w:t>
       </w:r>
       <w:r>
-        <w:rPr>
-          <w:lang w:val="en-BW"/>
-        </w:rPr>
         <w:br/>
       </w:r>
       <w:r>
         <w:rPr>
           <w:b/>
           <w:bCs/>
-          <w:lang w:val="en-BW"/>
-        </w:rPr>
-        <w:t>T_K dealership</w:t>
-      </w:r>
-      <w:r>
-        <w:rPr>
-          <w:lang w:val="en-BW"/>
-        </w:rPr>
+        </w:rPr>
+        <w:t>FASHIONHUB</w:t>
+      </w:r>
+      <w:r>
         <w:br/>
       </w:r>
-      <w:proofErr w:type="spellStart"/>
-      <w:r>
-        <w:rPr>
-          <w:b/>
-          <w:bCs/>
-          <w:lang w:val="en-BW"/>
-        </w:rPr>
-        <w:t>Mogoditshane</w:t>
-      </w:r>
-      <w:proofErr w:type="spellEnd"/>
-      <w:r>
-        <w:rPr>
-          <w:b/>
-          <w:bCs/>
-          <w:lang w:val="en-BW"/>
-        </w:rPr>
-        <w:t>, Gaborone, Botswana</w:t>
-      </w:r>
-      <w:r>
-        <w:rPr>
-          <w:lang w:val="en-BW"/>
-        </w:rPr>
+      <w:r>
+        <w:rPr>
+          <w:b/>
+          <w:bCs/>
+        </w:rPr>
+        <w:t>Mogoditshane, Gaborone, Botswana</w:t>
+      </w:r>
+      <w:r>
         <w:br/>
       </w:r>
       <w:r>
         <w:rPr>
           <w:b/>
           <w:bCs/>
-          <w:lang w:val="en-BW"/>
-        </w:rPr>
-        <w:t>+267 351 2467</w:t>
-      </w:r>
-      <w:r>
-        <w:rPr>
-          <w:lang w:val="en-BW"/>
-        </w:rPr>
+        </w:rPr>
+        <w:t xml:space="preserve">+267 </w:t>
+      </w:r>
+      <w:r>
+        <w:rPr>
+          <w:b/>
+          <w:bCs/>
+        </w:rPr>
+        <w:t>733 764 66</w:t>
+      </w:r>
+      <w:r>
         <w:br/>
       </w:r>
       <w:r>
         <w:rPr>
           <w:b/>
           <w:bCs/>
-          <w:lang w:val="en-BW"/>
-        </w:rPr>
-        <w:t>info@tkdealership.com</w:t>
+        </w:rPr>
+        <w:t>info@</w:t>
+      </w:r>
+      <w:r>
+        <w:rPr>
+          <w:b/>
+          <w:bCs/>
+        </w:rPr>
+        <w:t>fashionhub</w:t>
+      </w:r>
+      <w:r>
+        <w:rPr>
+          <w:b/>
+          <w:bCs/>
+        </w:rPr>
+        <w:t>.com</w:t>
       </w:r>
     </w:p>
     <w:p/>
@@ -2207,6 +1928,7 @@
   <w:style w:type="character" w:default="1" w:styleId="DefaultParagraphFont">
     <w:name w:val="Default Paragraph Font"/>
     <w:uiPriority w:val="1"/>
+    <w:semiHidden/>
     <w:unhideWhenUsed/>
   </w:style>
   <w:style w:type="table" w:default="1" w:styleId="TableNormal">

</xml_diff>